<commit_message>
build: regenerate Word versions after the audit fixes
SRS, SAD and Test Plan rebuilt from the corrected Markdown masters.
</commit_message>
<xml_diff>
--- a/submission/SAD-Blood-Bank-Management-System.docx
+++ b/submission/SAD-Blood-Bank-Management-System.docx
@@ -447,7 +447,7 @@
         <w:t>Date:</w:t>
       </w:r>
       <w:r>
-        <w:t xml:space="preserve"> 01 October 2026</w:t>
+        <w:t xml:space="preserve"> 04 October 2026</w:t>
       </w:r>
     </w:p>
     <w:p>
@@ -461,7 +461,7 @@
         <w:t>Status:</w:t>
       </w:r>
       <w:r>
-        <w:t xml:space="preserve"> Draft</w:t>
+        <w:t xml:space="preserve"> Final, for submission</w:t>
       </w:r>
     </w:p>
     <w:p>
@@ -823,7 +823,7 @@
               <w:rPr>
                 <w:sz w:val="18"/>
               </w:rPr>
-              <w:t>—</w:t>
+              <w:t>04 Oct 2026</w:t>
             </w:r>
           </w:p>
         </w:tc>
@@ -840,7 +840,7 @@
               <w:rPr>
                 <w:sz w:val="18"/>
               </w:rPr>
-              <w:t>All Members</w:t>
+              <w:t>G A Aadish</w:t>
             </w:r>
           </w:p>
         </w:tc>
@@ -857,7 +857,7 @@
               <w:rPr>
                 <w:sz w:val="18"/>
               </w:rPr>
-              <w:t>Consistency pass, approved for submission.</w:t>
+              <w:t>Audit against the Deliverable 2 checklist and the SRS. Status and dates aligned.</w:t>
             </w:r>
           </w:p>
         </w:tc>

</xml_diff>